<commit_message>
fix: restore objectiveSuffixes before renderLockedObjectives on page load
</commit_message>
<xml_diff>
--- a/views/template_programme.docx
+++ b/views/template_programme.docx
@@ -872,14 +872,6 @@
           <w:szCs w:val="22"/>
           <w:lang w:val="fr-FR"/>
         </w:rPr>
-        <w:sectPr>
-          <w:headerReference w:type="default" r:id="rId7"/>
-          <w:footerReference w:type="default" r:id="rId8"/>
-          <w:pgSz w:w="11906" w:h="16838"/>
-          <w:pgMar w:top="1440" w:right="1440" w:bottom="1440" w:left="1440" w:header="271" w:footer="708" w:gutter="0"/>
-          <w:cols w:space="708"/>
-          <w:docGrid w:linePitch="360"/>
-        </w:sectPr>
       </w:pPr>
     </w:p>
     <w:p>
@@ -1069,13 +1061,6 @@
           <w:szCs w:val="28"/>
           <w:lang w:val="fr-FR" w:eastAsia="en-GB"/>
         </w:rPr>
-        <w:sectPr>
-          <w:type w:val="continuous"/>
-          <w:pgSz w:w="11906" w:h="16838"/>
-          <w:pgMar w:top="1440" w:right="1440" w:bottom="1440" w:left="1440" w:header="271" w:footer="708" w:gutter="0"/>
-          <w:cols w:num="2" w:space="708"/>
-          <w:docGrid w:linePitch="360"/>
-        </w:sectPr>
       </w:pPr>
     </w:p>
     <w:p>

</xml_diff>